<commit_message>
Update articulo 3 with all generated files
</commit_message>
<xml_diff>
--- a/articulo 1/informe_articulo.docx
+++ b/articulo 1/informe_articulo.docx
@@ -20,15 +20,11 @@
         <w:jc w:val="center"/>
       </w:pPr>
       <w:r>
-        <w:rPr>
-          <w:rFonts w:ascii="Times New Roman" w:hAnsi="Times New Roman"/>
-          <w:sz w:val="24"/>
-        </w:rPr>
         <w:t>Estudiante de Economía</w:t>
         <w:br/>
         <w:t>Facultad de Ingeniería Económica, Universidad Nacional del Altiplano</w:t>
         <w:br/>
-        <w:t>[enlace al archivo de Google Colab]</w:t>
+        <w:t>https://colab.research.google.com/github/gaelrenzo/amor-al-arte/blob/main/notebook_svar.ipynb</w:t>
       </w:r>
     </w:p>
     <w:p>

</xml_diff>